<commit_message>
Cập nhật code hệ thống và bổ sung file cấu hình bảo mật vào gitignore
</commit_message>
<xml_diff>
--- a/templatesHopDong/Template_HDNT.docx
+++ b/templatesHopDong/Template_HDNT.docx
@@ -4,7 +4,7 @@
   <w:body>
     <w:tbl>
       <w:tblPr>
-        <w:tblStyle w:val="TableGrid"/>
+        <w:tblStyle w:val="LiBang"/>
         <w:tblW w:w="5000" w:type="pct"/>
         <w:jc w:val="center"/>
         <w:tblBorders>
@@ -462,7 +462,7 @@
     </w:p>
     <w:p>
       <w:pPr>
-        <w:pStyle w:val="ListParagraph"/>
+        <w:pStyle w:val="oancuaDanhsach"/>
         <w:numPr>
           <w:ilvl w:val="0"/>
           <w:numId w:val="1"/>
@@ -560,7 +560,7 @@
     </w:p>
     <w:tbl>
       <w:tblPr>
-        <w:tblStyle w:val="TableGrid"/>
+        <w:tblStyle w:val="LiBang"/>
         <w:tblW w:w="10031" w:type="dxa"/>
         <w:tblBorders>
           <w:top w:val="none" w:sz="0" w:space="0" w:color="auto"/>
@@ -1148,7 +1148,7 @@
     </w:tbl>
     <w:p>
       <w:pPr>
-        <w:pStyle w:val="ListParagraph"/>
+        <w:pStyle w:val="oancuaDanhsach"/>
         <w:numPr>
           <w:ilvl w:val="0"/>
           <w:numId w:val="1"/>
@@ -1246,7 +1246,7 @@
     </w:p>
     <w:tbl>
       <w:tblPr>
-        <w:tblStyle w:val="TableGrid"/>
+        <w:tblStyle w:val="LiBang"/>
         <w:tblW w:w="10031" w:type="dxa"/>
         <w:tblBorders>
           <w:top w:val="none" w:sz="0" w:space="0" w:color="auto"/>
@@ -1819,7 +1819,7 @@
     </w:p>
     <w:p>
       <w:pPr>
-        <w:pStyle w:val="ListParagraph"/>
+        <w:pStyle w:val="oancuaDanhsach"/>
         <w:numPr>
           <w:ilvl w:val="0"/>
           <w:numId w:val="8"/>
@@ -1911,7 +1911,7 @@
     </w:p>
     <w:p>
       <w:pPr>
-        <w:pStyle w:val="ListParagraph"/>
+        <w:pStyle w:val="oancuaDanhsach"/>
         <w:numPr>
           <w:ilvl w:val="0"/>
           <w:numId w:val="8"/>
@@ -1938,7 +1938,7 @@
     </w:p>
     <w:p>
       <w:pPr>
-        <w:pStyle w:val="ListParagraph"/>
+        <w:pStyle w:val="oancuaDanhsach"/>
         <w:numPr>
           <w:ilvl w:val="0"/>
           <w:numId w:val="9"/>
@@ -2091,7 +2091,7 @@
     </w:p>
     <w:p>
       <w:pPr>
-        <w:pStyle w:val="ListParagraph"/>
+        <w:pStyle w:val="oancuaDanhsach"/>
         <w:numPr>
           <w:ilvl w:val="0"/>
           <w:numId w:val="9"/>
@@ -2116,7 +2116,7 @@
     </w:p>
     <w:p>
       <w:pPr>
-        <w:pStyle w:val="ListParagraph"/>
+        <w:pStyle w:val="oancuaDanhsach"/>
         <w:numPr>
           <w:ilvl w:val="0"/>
           <w:numId w:val="9"/>
@@ -2141,7 +2141,7 @@
     </w:p>
     <w:p>
       <w:pPr>
-        <w:pStyle w:val="ListParagraph"/>
+        <w:pStyle w:val="oancuaDanhsach"/>
         <w:numPr>
           <w:ilvl w:val="0"/>
           <w:numId w:val="8"/>
@@ -2180,7 +2180,7 @@
     </w:p>
     <w:p>
       <w:pPr>
-        <w:pStyle w:val="ListParagraph"/>
+        <w:pStyle w:val="oancuaDanhsach"/>
         <w:numPr>
           <w:ilvl w:val="0"/>
           <w:numId w:val="9"/>
@@ -2223,7 +2223,7 @@
     <w:bookmarkEnd w:id="0"/>
     <w:p>
       <w:pPr>
-        <w:pStyle w:val="ListParagraph"/>
+        <w:pStyle w:val="oancuaDanhsach"/>
         <w:numPr>
           <w:ilvl w:val="0"/>
           <w:numId w:val="8"/>
@@ -2252,7 +2252,7 @@
     </w:p>
     <w:p>
       <w:pPr>
-        <w:pStyle w:val="ListParagraph"/>
+        <w:pStyle w:val="oancuaDanhsach"/>
         <w:numPr>
           <w:ilvl w:val="0"/>
           <w:numId w:val="9"/>
@@ -2309,7 +2309,7 @@
     </w:p>
     <w:p>
       <w:pPr>
-        <w:pStyle w:val="ListParagraph"/>
+        <w:pStyle w:val="oancuaDanhsach"/>
         <w:numPr>
           <w:ilvl w:val="0"/>
           <w:numId w:val="8"/>
@@ -2338,7 +2338,7 @@
     </w:p>
     <w:p>
       <w:pPr>
-        <w:pStyle w:val="ListParagraph"/>
+        <w:pStyle w:val="oancuaDanhsach"/>
         <w:numPr>
           <w:ilvl w:val="0"/>
           <w:numId w:val="9"/>
@@ -2363,7 +2363,7 @@
     </w:p>
     <w:p>
       <w:pPr>
-        <w:pStyle w:val="ListParagraph"/>
+        <w:pStyle w:val="oancuaDanhsach"/>
         <w:numPr>
           <w:ilvl w:val="0"/>
           <w:numId w:val="9"/>
@@ -2423,7 +2423,7 @@
     </w:p>
     <w:p>
       <w:pPr>
-        <w:pStyle w:val="ListParagraph"/>
+        <w:pStyle w:val="oancuaDanhsach"/>
         <w:numPr>
           <w:ilvl w:val="0"/>
           <w:numId w:val="8"/>
@@ -2452,7 +2452,7 @@
     </w:p>
     <w:p>
       <w:pPr>
-        <w:pStyle w:val="ListParagraph"/>
+        <w:pStyle w:val="oancuaDanhsach"/>
         <w:numPr>
           <w:ilvl w:val="1"/>
           <w:numId w:val="8"/>
@@ -2481,7 +2481,7 @@
     </w:p>
     <w:p>
       <w:pPr>
-        <w:pStyle w:val="ListParagraph"/>
+        <w:pStyle w:val="oancuaDanhsach"/>
         <w:numPr>
           <w:ilvl w:val="0"/>
           <w:numId w:val="9"/>
@@ -2506,7 +2506,7 @@
     </w:p>
     <w:p>
       <w:pPr>
-        <w:pStyle w:val="ListParagraph"/>
+        <w:pStyle w:val="oancuaDanhsach"/>
         <w:numPr>
           <w:ilvl w:val="0"/>
           <w:numId w:val="9"/>
@@ -2531,7 +2531,7 @@
     </w:p>
     <w:p>
       <w:pPr>
-        <w:pStyle w:val="ListParagraph"/>
+        <w:pStyle w:val="oancuaDanhsach"/>
         <w:numPr>
           <w:ilvl w:val="0"/>
           <w:numId w:val="9"/>
@@ -2572,7 +2572,7 @@
     </w:p>
     <w:p>
       <w:pPr>
-        <w:pStyle w:val="ListParagraph"/>
+        <w:pStyle w:val="oancuaDanhsach"/>
         <w:numPr>
           <w:ilvl w:val="0"/>
           <w:numId w:val="9"/>
@@ -2597,7 +2597,7 @@
     </w:p>
     <w:p>
       <w:pPr>
-        <w:pStyle w:val="ListParagraph"/>
+        <w:pStyle w:val="oancuaDanhsach"/>
         <w:numPr>
           <w:ilvl w:val="1"/>
           <w:numId w:val="8"/>
@@ -2626,7 +2626,7 @@
     </w:p>
     <w:p>
       <w:pPr>
-        <w:pStyle w:val="ListParagraph"/>
+        <w:pStyle w:val="oancuaDanhsach"/>
         <w:numPr>
           <w:ilvl w:val="0"/>
           <w:numId w:val="9"/>
@@ -2651,7 +2651,7 @@
     </w:p>
     <w:p>
       <w:pPr>
-        <w:pStyle w:val="ListParagraph"/>
+        <w:pStyle w:val="oancuaDanhsach"/>
         <w:numPr>
           <w:ilvl w:val="0"/>
           <w:numId w:val="9"/>
@@ -2671,12 +2671,12 @@
           <w:szCs w:val="26"/>
           <w:lang w:val="en-US"/>
         </w:rPr>
-        <w:t>Thợ vận hành máy phải luôn có mặt tại công trường trong giờ làm việc.</w:t>
+        <w:t xml:space="preserve">Vận chuyển hàng hoá bảo đảm, an toàn đến giao tận địa chi đã đăng kí của bên A; </w:t>
       </w:r>
     </w:p>
     <w:p>
       <w:pPr>
-        <w:pStyle w:val="ListParagraph"/>
+        <w:pStyle w:val="oancuaDanhsach"/>
         <w:numPr>
           <w:ilvl w:val="0"/>
           <w:numId w:val="9"/>
@@ -2696,12 +2696,28 @@
           <w:szCs w:val="26"/>
           <w:lang w:val="en-US"/>
         </w:rPr>
-        <w:t>Đảm bảo máy luôn vận hành tốt. Nếu do lỗi thiết bị, máy phải ngừng hoạt động trên 30 phút thì bên A có trách nhiệm làm bù giờ cho những giờ máy ngừng hoạt động.</w:t>
+        <w:t xml:space="preserve">Cùng bên B lập </w:t>
+      </w:r>
+      <w:r>
+        <w:rPr>
+          <w:sz w:val="26"/>
+          <w:szCs w:val="26"/>
+          <w:lang w:val="en-US"/>
+        </w:rPr>
+        <w:t>Biên bản xác nhận khối lượng vật tư</w:t>
+      </w:r>
+      <w:r>
+        <w:rPr>
+          <w:sz w:val="26"/>
+          <w:szCs w:val="26"/>
+          <w:lang w:val="en-US"/>
+        </w:rPr>
+        <w:t xml:space="preserve"> thực tế để làm cơ sở thanh toán và thanh lý hợp đồng.</w:t>
       </w:r>
     </w:p>
     <w:p>
       <w:pPr>
-        <w:pStyle w:val="ListParagraph"/>
+        <w:pStyle w:val="oancuaDanhsach"/>
         <w:numPr>
           <w:ilvl w:val="0"/>
           <w:numId w:val="9"/>
@@ -2721,12 +2737,41 @@
           <w:szCs w:val="26"/>
           <w:lang w:val="en-US"/>
         </w:rPr>
-        <w:t>Đảm bảo tính hợp pháp của thiết bị khi các cơ quan có trách nhiệm kiểm tra.</w:t>
+        <w:t>Xuất hóa đơn thuế GTGT cho bên A .</w:t>
       </w:r>
     </w:p>
     <w:p>
       <w:pPr>
-        <w:pStyle w:val="ListParagraph"/>
+        <w:pStyle w:val="oancuaDanhsach"/>
+        <w:numPr>
+          <w:ilvl w:val="0"/>
+          <w:numId w:val="8"/>
+        </w:numPr>
+        <w:spacing w:before="120" w:after="120" w:line="276" w:lineRule="auto"/>
+        <w:contextualSpacing w:val="0"/>
+        <w:jc w:val="both"/>
+        <w:rPr>
+          <w:b/>
+          <w:bCs/>
+          <w:sz w:val="26"/>
+          <w:szCs w:val="26"/>
+          <w:lang w:val="en-US"/>
+        </w:rPr>
+      </w:pPr>
+      <w:r>
+        <w:rPr>
+          <w:b/>
+          <w:bCs/>
+          <w:sz w:val="26"/>
+          <w:szCs w:val="26"/>
+          <w:lang w:val="en-US"/>
+        </w:rPr>
+        <w:t>Điều khoản khác:</w:t>
+      </w:r>
+    </w:p>
+    <w:p>
+      <w:pPr>
+        <w:pStyle w:val="oancuaDanhsach"/>
         <w:numPr>
           <w:ilvl w:val="0"/>
           <w:numId w:val="9"/>
@@ -2746,12 +2791,28 @@
           <w:szCs w:val="26"/>
           <w:lang w:val="en-US"/>
         </w:rPr>
-        <w:t xml:space="preserve">Vận chuyển hàng hoá bảo đảm, an toàn đến giao tận địa chi đã đăng kí của bên A; </w:t>
+        <w:t>Hai bên cam kết thực hiện đúng các điều khoản đã thống nhất trong hợp đồng. Trong quá trình thực hiện hợp đồng nếu có</w:t>
+      </w:r>
+      <w:r>
+        <w:rPr>
+          <w:sz w:val="26"/>
+          <w:szCs w:val="26"/>
+          <w:lang w:val="en-US"/>
+        </w:rPr>
+        <w:t xml:space="preserve"> </w:t>
+      </w:r>
+      <w:r>
+        <w:rPr>
+          <w:sz w:val="26"/>
+          <w:szCs w:val="26"/>
+          <w:lang w:val="en-US"/>
+        </w:rPr>
+        <w:t xml:space="preserve">gì vướng mắc, phát sinh hay thay đổi, hai bên chủ động gặp nhau bàn bạc giải quyết. Trong trường hợp không giải quyết được sẽ đưa ra tòa án Kinh tế có thẩm quyền để phân xử. Quyết định của tòa án là phán quyết cuối cùng. </w:t>
       </w:r>
     </w:p>
     <w:p>
       <w:pPr>
-        <w:pStyle w:val="ListParagraph"/>
+        <w:pStyle w:val="oancuaDanhsach"/>
         <w:numPr>
           <w:ilvl w:val="0"/>
           <w:numId w:val="9"/>
@@ -2771,28 +2832,12 @@
           <w:szCs w:val="26"/>
           <w:lang w:val="en-US"/>
         </w:rPr>
-        <w:t xml:space="preserve">Cùng bên B lập </w:t>
-      </w:r>
-      <w:r>
-        <w:rPr>
-          <w:sz w:val="26"/>
-          <w:szCs w:val="26"/>
-          <w:lang w:val="en-US"/>
-        </w:rPr>
-        <w:t>Biên bản xác nhận khối lượng vật tư</w:t>
-      </w:r>
-      <w:r>
-        <w:rPr>
-          <w:sz w:val="26"/>
-          <w:szCs w:val="26"/>
-          <w:lang w:val="en-US"/>
-        </w:rPr>
-        <w:t xml:space="preserve"> thực tế để làm cơ sở thanh toán và thanh lý hợp đồng.</w:t>
+        <w:t>Hợp đồng này có hiệu lực kể từ ngày ký và hết hiệu lực khi các bên đã thực hiện xong các điều khoản của hợp đồng. Sau khi các bên hoàn thành đầy đủ nghĩa vụ của mình theo thỏa thuận trong hợp đồng thì hợp đồng được xem như thanh lý .</w:t>
       </w:r>
     </w:p>
     <w:p>
       <w:pPr>
-        <w:pStyle w:val="ListParagraph"/>
+        <w:pStyle w:val="oancuaDanhsach"/>
         <w:numPr>
           <w:ilvl w:val="0"/>
           <w:numId w:val="9"/>
@@ -2812,126 +2857,6 @@
           <w:szCs w:val="26"/>
           <w:lang w:val="en-US"/>
         </w:rPr>
-        <w:t>Xuất hóa đơn thuế GTGT cho bên A .</w:t>
-      </w:r>
-    </w:p>
-    <w:p>
-      <w:pPr>
-        <w:pStyle w:val="ListParagraph"/>
-        <w:numPr>
-          <w:ilvl w:val="0"/>
-          <w:numId w:val="8"/>
-        </w:numPr>
-        <w:spacing w:before="120" w:after="120" w:line="276" w:lineRule="auto"/>
-        <w:contextualSpacing w:val="0"/>
-        <w:jc w:val="both"/>
-        <w:rPr>
-          <w:b/>
-          <w:bCs/>
-          <w:sz w:val="26"/>
-          <w:szCs w:val="26"/>
-          <w:lang w:val="en-US"/>
-        </w:rPr>
-      </w:pPr>
-      <w:r>
-        <w:rPr>
-          <w:b/>
-          <w:bCs/>
-          <w:sz w:val="26"/>
-          <w:szCs w:val="26"/>
-          <w:lang w:val="en-US"/>
-        </w:rPr>
-        <w:t>Điều khoản khác:</w:t>
-      </w:r>
-    </w:p>
-    <w:p>
-      <w:pPr>
-        <w:pStyle w:val="ListParagraph"/>
-        <w:numPr>
-          <w:ilvl w:val="0"/>
-          <w:numId w:val="9"/>
-        </w:numPr>
-        <w:spacing w:after="0" w:line="276" w:lineRule="auto"/>
-        <w:ind w:left="0" w:firstLine="360"/>
-        <w:jc w:val="both"/>
-        <w:rPr>
-          <w:sz w:val="26"/>
-          <w:szCs w:val="26"/>
-          <w:lang w:val="en-US"/>
-        </w:rPr>
-      </w:pPr>
-      <w:r>
-        <w:rPr>
-          <w:sz w:val="26"/>
-          <w:szCs w:val="26"/>
-          <w:lang w:val="en-US"/>
-        </w:rPr>
-        <w:t>Hai bên cam kết thực hiện đúng các điều khoản đã thống nhất trong hợp đồng. Trong quá trình thực hiện hợp đồng nếu có</w:t>
-      </w:r>
-      <w:r>
-        <w:rPr>
-          <w:sz w:val="26"/>
-          <w:szCs w:val="26"/>
-          <w:lang w:val="en-US"/>
-        </w:rPr>
-        <w:t xml:space="preserve"> </w:t>
-      </w:r>
-      <w:r>
-        <w:rPr>
-          <w:sz w:val="26"/>
-          <w:szCs w:val="26"/>
-          <w:lang w:val="en-US"/>
-        </w:rPr>
-        <w:t xml:space="preserve">gì vướng mắc, phát sinh hay thay đổi, hai bên chủ động gặp nhau bàn bạc giải quyết. Trong trường hợp không giải quyết được sẽ đưa ra tòa án Kinh tế có thẩm quyền để phân xử. Quyết định của tòa án là phán quyết cuối cùng. </w:t>
-      </w:r>
-    </w:p>
-    <w:p>
-      <w:pPr>
-        <w:pStyle w:val="ListParagraph"/>
-        <w:numPr>
-          <w:ilvl w:val="0"/>
-          <w:numId w:val="9"/>
-        </w:numPr>
-        <w:spacing w:after="0" w:line="276" w:lineRule="auto"/>
-        <w:ind w:left="0" w:firstLine="360"/>
-        <w:jc w:val="both"/>
-        <w:rPr>
-          <w:sz w:val="26"/>
-          <w:szCs w:val="26"/>
-          <w:lang w:val="en-US"/>
-        </w:rPr>
-      </w:pPr>
-      <w:r>
-        <w:rPr>
-          <w:sz w:val="26"/>
-          <w:szCs w:val="26"/>
-          <w:lang w:val="en-US"/>
-        </w:rPr>
-        <w:t>Hợp đồng này có hiệu lực kể từ ngày ký và hết hiệu lực khi các bên đã thực hiện xong các điều khoản của hợp đồng. Sau khi các bên hoàn thành đầy đủ nghĩa vụ của mình theo thỏa thuận trong hợp đồng thì hợp đồng được xem như thanh lý .</w:t>
-      </w:r>
-    </w:p>
-    <w:p>
-      <w:pPr>
-        <w:pStyle w:val="ListParagraph"/>
-        <w:numPr>
-          <w:ilvl w:val="0"/>
-          <w:numId w:val="9"/>
-        </w:numPr>
-        <w:spacing w:after="0" w:line="276" w:lineRule="auto"/>
-        <w:ind w:left="0" w:firstLine="360"/>
-        <w:jc w:val="both"/>
-        <w:rPr>
-          <w:sz w:val="26"/>
-          <w:szCs w:val="26"/>
-          <w:lang w:val="en-US"/>
-        </w:rPr>
-      </w:pPr>
-      <w:r>
-        <w:rPr>
-          <w:sz w:val="26"/>
-          <w:szCs w:val="26"/>
-          <w:lang w:val="en-US"/>
-        </w:rPr>
         <w:t>Hợp đồng được lập thành 4 bản có giá trị như nhau, Bên A giữ 02 bản, bên B giữ 02 bản và có giá trị pháp lý như nhau.</w:t>
       </w:r>
     </w:p>
@@ -2948,8 +2873,8 @@
     </w:p>
     <w:tbl>
       <w:tblPr>
-        <w:tblStyle w:val="TableGrid"/>
-        <w:tblW w:w="0" w:type="auto"/>
+        <w:tblStyle w:val="LiBang"/>
+        <w:tblW w:w="5000" w:type="pct"/>
         <w:tblBorders>
           <w:top w:val="none" w:sz="0" w:space="0" w:color="auto"/>
           <w:left w:val="none" w:sz="0" w:space="0" w:color="auto"/>
@@ -2961,13 +2886,13 @@
         <w:tblLook w:val="04A0" w:firstRow="1" w:lastRow="0" w:firstColumn="1" w:lastColumn="0" w:noHBand="0" w:noVBand="1"/>
       </w:tblPr>
       <w:tblGrid>
-        <w:gridCol w:w="5068"/>
-        <w:gridCol w:w="5069"/>
+        <w:gridCol w:w="5244"/>
+        <w:gridCol w:w="5244"/>
       </w:tblGrid>
       <w:tr>
         <w:tc>
           <w:tcPr>
-            <w:tcW w:w="5068" w:type="dxa"/>
+            <w:tcW w:w="2500" w:type="pct"/>
           </w:tcPr>
           <w:p>
             <w:pPr>
@@ -2995,7 +2920,7 @@
         </w:tc>
         <w:tc>
           <w:tcPr>
-            <w:tcW w:w="5069" w:type="dxa"/>
+            <w:tcW w:w="2500" w:type="pct"/>
           </w:tcPr>
           <w:p>
             <w:pPr>
@@ -3025,7 +2950,7 @@
       <w:tr>
         <w:tc>
           <w:tcPr>
-            <w:tcW w:w="5068" w:type="dxa"/>
+            <w:tcW w:w="2500" w:type="pct"/>
           </w:tcPr>
           <w:p>
             <w:pPr>
@@ -3074,7 +2999,7 @@
         </w:tc>
         <w:tc>
           <w:tcPr>
-            <w:tcW w:w="5069" w:type="dxa"/>
+            <w:tcW w:w="2500" w:type="pct"/>
           </w:tcPr>
           <w:p>
             <w:pPr>
@@ -3092,7 +3017,7 @@
       <w:tr>
         <w:tc>
           <w:tcPr>
-            <w:tcW w:w="5068" w:type="dxa"/>
+            <w:tcW w:w="2500" w:type="pct"/>
           </w:tcPr>
           <w:p>
             <w:pPr>
@@ -3140,7 +3065,7 @@
         </w:tc>
         <w:tc>
           <w:tcPr>
-            <w:tcW w:w="5069" w:type="dxa"/>
+            <w:tcW w:w="2500" w:type="pct"/>
           </w:tcPr>
           <w:p>
             <w:pPr>
@@ -3252,7 +3177,7 @@
     <w:sdtContent>
       <w:p>
         <w:pPr>
-          <w:pStyle w:val="Footer"/>
+          <w:pStyle w:val="Chntrang"/>
           <w:jc w:val="center"/>
           <w:rPr>
             <w:sz w:val="20"/>
@@ -5088,15 +5013,15 @@
     <w:lsdException w:name="Unresolved Mention" w:semiHidden="1" w:unhideWhenUsed="1"/>
     <w:lsdException w:name="Smart Link" w:semiHidden="1" w:unhideWhenUsed="1"/>
   </w:latentStyles>
-  <w:style w:type="paragraph" w:default="1" w:styleId="Normal">
+  <w:style w:type="paragraph" w:default="1" w:styleId="Binhthng">
     <w:name w:val="Normal"/>
     <w:qFormat/>
   </w:style>
-  <w:style w:type="paragraph" w:styleId="Heading1">
+  <w:style w:type="paragraph" w:styleId="u1">
     <w:name w:val="heading 1"/>
-    <w:basedOn w:val="Normal"/>
-    <w:next w:val="Normal"/>
-    <w:link w:val="Heading1Char"/>
+    <w:basedOn w:val="Binhthng"/>
+    <w:next w:val="Binhthng"/>
+    <w:link w:val="u1Char"/>
     <w:uiPriority w:val="9"/>
     <w:qFormat/>
     <w:rsid w:val="0068110B"/>
@@ -5113,11 +5038,11 @@
       <w:szCs w:val="40"/>
     </w:rPr>
   </w:style>
-  <w:style w:type="paragraph" w:styleId="Heading2">
+  <w:style w:type="paragraph" w:styleId="u2">
     <w:name w:val="heading 2"/>
-    <w:basedOn w:val="Normal"/>
-    <w:next w:val="Normal"/>
-    <w:link w:val="Heading2Char"/>
+    <w:basedOn w:val="Binhthng"/>
+    <w:next w:val="Binhthng"/>
+    <w:link w:val="u2Char"/>
     <w:uiPriority w:val="9"/>
     <w:semiHidden/>
     <w:unhideWhenUsed/>
@@ -5136,11 +5061,11 @@
       <w:szCs w:val="32"/>
     </w:rPr>
   </w:style>
-  <w:style w:type="paragraph" w:styleId="Heading3">
+  <w:style w:type="paragraph" w:styleId="u3">
     <w:name w:val="heading 3"/>
-    <w:basedOn w:val="Normal"/>
-    <w:next w:val="Normal"/>
-    <w:link w:val="Heading3Char"/>
+    <w:basedOn w:val="Binhthng"/>
+    <w:next w:val="Binhthng"/>
+    <w:link w:val="u3Char"/>
     <w:uiPriority w:val="9"/>
     <w:semiHidden/>
     <w:unhideWhenUsed/>
@@ -5159,11 +5084,11 @@
       <w:szCs w:val="28"/>
     </w:rPr>
   </w:style>
-  <w:style w:type="paragraph" w:styleId="Heading4">
+  <w:style w:type="paragraph" w:styleId="u4">
     <w:name w:val="heading 4"/>
-    <w:basedOn w:val="Normal"/>
-    <w:next w:val="Normal"/>
-    <w:link w:val="Heading4Char"/>
+    <w:basedOn w:val="Binhthng"/>
+    <w:next w:val="Binhthng"/>
+    <w:link w:val="u4Char"/>
     <w:uiPriority w:val="9"/>
     <w:semiHidden/>
     <w:unhideWhenUsed/>
@@ -5182,11 +5107,11 @@
       <w:color w:val="0F4761" w:themeColor="accent1" w:themeShade="BF"/>
     </w:rPr>
   </w:style>
-  <w:style w:type="paragraph" w:styleId="Heading5">
+  <w:style w:type="paragraph" w:styleId="u5">
     <w:name w:val="heading 5"/>
-    <w:basedOn w:val="Normal"/>
-    <w:next w:val="Normal"/>
-    <w:link w:val="Heading5Char"/>
+    <w:basedOn w:val="Binhthng"/>
+    <w:next w:val="Binhthng"/>
+    <w:link w:val="u5Char"/>
     <w:uiPriority w:val="9"/>
     <w:semiHidden/>
     <w:unhideWhenUsed/>
@@ -5203,11 +5128,11 @@
       <w:color w:val="0F4761" w:themeColor="accent1" w:themeShade="BF"/>
     </w:rPr>
   </w:style>
-  <w:style w:type="paragraph" w:styleId="Heading6">
+  <w:style w:type="paragraph" w:styleId="u6">
     <w:name w:val="heading 6"/>
-    <w:basedOn w:val="Normal"/>
-    <w:next w:val="Normal"/>
-    <w:link w:val="Heading6Char"/>
+    <w:basedOn w:val="Binhthng"/>
+    <w:next w:val="Binhthng"/>
+    <w:link w:val="u6Char"/>
     <w:uiPriority w:val="9"/>
     <w:semiHidden/>
     <w:unhideWhenUsed/>
@@ -5226,11 +5151,11 @@
       <w:color w:val="595959" w:themeColor="text1" w:themeTint="A6"/>
     </w:rPr>
   </w:style>
-  <w:style w:type="paragraph" w:styleId="Heading7">
+  <w:style w:type="paragraph" w:styleId="u7">
     <w:name w:val="heading 7"/>
-    <w:basedOn w:val="Normal"/>
-    <w:next w:val="Normal"/>
-    <w:link w:val="Heading7Char"/>
+    <w:basedOn w:val="Binhthng"/>
+    <w:next w:val="Binhthng"/>
+    <w:link w:val="u7Char"/>
     <w:uiPriority w:val="9"/>
     <w:semiHidden/>
     <w:unhideWhenUsed/>
@@ -5247,11 +5172,11 @@
       <w:color w:val="595959" w:themeColor="text1" w:themeTint="A6"/>
     </w:rPr>
   </w:style>
-  <w:style w:type="paragraph" w:styleId="Heading8">
+  <w:style w:type="paragraph" w:styleId="u8">
     <w:name w:val="heading 8"/>
-    <w:basedOn w:val="Normal"/>
-    <w:next w:val="Normal"/>
-    <w:link w:val="Heading8Char"/>
+    <w:basedOn w:val="Binhthng"/>
+    <w:next w:val="Binhthng"/>
+    <w:link w:val="u8Char"/>
     <w:uiPriority w:val="9"/>
     <w:semiHidden/>
     <w:unhideWhenUsed/>
@@ -5270,11 +5195,11 @@
       <w:color w:val="272727" w:themeColor="text1" w:themeTint="D8"/>
     </w:rPr>
   </w:style>
-  <w:style w:type="paragraph" w:styleId="Heading9">
+  <w:style w:type="paragraph" w:styleId="u9">
     <w:name w:val="heading 9"/>
-    <w:basedOn w:val="Normal"/>
-    <w:next w:val="Normal"/>
-    <w:link w:val="Heading9Char"/>
+    <w:basedOn w:val="Binhthng"/>
+    <w:next w:val="Binhthng"/>
+    <w:link w:val="u9Char"/>
     <w:uiPriority w:val="9"/>
     <w:semiHidden/>
     <w:unhideWhenUsed/>
@@ -5291,13 +5216,13 @@
       <w:color w:val="272727" w:themeColor="text1" w:themeTint="D8"/>
     </w:rPr>
   </w:style>
-  <w:style w:type="character" w:default="1" w:styleId="DefaultParagraphFont">
+  <w:style w:type="character" w:default="1" w:styleId="Phngmcinhcuaoanvn">
     <w:name w:val="Default Paragraph Font"/>
     <w:uiPriority w:val="1"/>
     <w:semiHidden/>
     <w:unhideWhenUsed/>
   </w:style>
-  <w:style w:type="table" w:default="1" w:styleId="TableNormal">
+  <w:style w:type="table" w:default="1" w:styleId="BangThngthng">
     <w:name w:val="Normal Table"/>
     <w:uiPriority w:val="99"/>
     <w:semiHidden/>
@@ -5312,16 +5237,16 @@
       </w:tblCellMar>
     </w:tblPr>
   </w:style>
-  <w:style w:type="numbering" w:default="1" w:styleId="NoList">
+  <w:style w:type="numbering" w:default="1" w:styleId="Khngco">
     <w:name w:val="No List"/>
     <w:uiPriority w:val="99"/>
     <w:semiHidden/>
     <w:unhideWhenUsed/>
   </w:style>
-  <w:style w:type="character" w:customStyle="1" w:styleId="Heading1Char">
-    <w:name w:val="Heading 1 Char"/>
-    <w:basedOn w:val="DefaultParagraphFont"/>
-    <w:link w:val="Heading1"/>
+  <w:style w:type="character" w:customStyle="1" w:styleId="u1Char">
+    <w:name w:val="Đầu đề 1 Char"/>
+    <w:basedOn w:val="Phngmcinhcuaoanvn"/>
+    <w:link w:val="u1"/>
     <w:uiPriority w:val="9"/>
     <w:rsid w:val="0068110B"/>
     <w:rPr>
@@ -5331,10 +5256,10 @@
       <w:szCs w:val="40"/>
     </w:rPr>
   </w:style>
-  <w:style w:type="character" w:customStyle="1" w:styleId="Heading2Char">
-    <w:name w:val="Heading 2 Char"/>
-    <w:basedOn w:val="DefaultParagraphFont"/>
-    <w:link w:val="Heading2"/>
+  <w:style w:type="character" w:customStyle="1" w:styleId="u2Char">
+    <w:name w:val="Đầu đề 2 Char"/>
+    <w:basedOn w:val="Phngmcinhcuaoanvn"/>
+    <w:link w:val="u2"/>
     <w:uiPriority w:val="9"/>
     <w:semiHidden/>
     <w:rsid w:val="0068110B"/>
@@ -5345,10 +5270,10 @@
       <w:szCs w:val="32"/>
     </w:rPr>
   </w:style>
-  <w:style w:type="character" w:customStyle="1" w:styleId="Heading3Char">
-    <w:name w:val="Heading 3 Char"/>
-    <w:basedOn w:val="DefaultParagraphFont"/>
-    <w:link w:val="Heading3"/>
+  <w:style w:type="character" w:customStyle="1" w:styleId="u3Char">
+    <w:name w:val="Đầu đề 3 Char"/>
+    <w:basedOn w:val="Phngmcinhcuaoanvn"/>
+    <w:link w:val="u3"/>
     <w:uiPriority w:val="9"/>
     <w:semiHidden/>
     <w:rsid w:val="0068110B"/>
@@ -5359,10 +5284,10 @@
       <w:szCs w:val="28"/>
     </w:rPr>
   </w:style>
-  <w:style w:type="character" w:customStyle="1" w:styleId="Heading4Char">
-    <w:name w:val="Heading 4 Char"/>
-    <w:basedOn w:val="DefaultParagraphFont"/>
-    <w:link w:val="Heading4"/>
+  <w:style w:type="character" w:customStyle="1" w:styleId="u4Char">
+    <w:name w:val="Đầu đề 4 Char"/>
+    <w:basedOn w:val="Phngmcinhcuaoanvn"/>
+    <w:link w:val="u4"/>
     <w:uiPriority w:val="9"/>
     <w:semiHidden/>
     <w:rsid w:val="0068110B"/>
@@ -5373,10 +5298,10 @@
       <w:color w:val="0F4761" w:themeColor="accent1" w:themeShade="BF"/>
     </w:rPr>
   </w:style>
-  <w:style w:type="character" w:customStyle="1" w:styleId="Heading5Char">
-    <w:name w:val="Heading 5 Char"/>
-    <w:basedOn w:val="DefaultParagraphFont"/>
-    <w:link w:val="Heading5"/>
+  <w:style w:type="character" w:customStyle="1" w:styleId="u5Char">
+    <w:name w:val="Đầu đề 5 Char"/>
+    <w:basedOn w:val="Phngmcinhcuaoanvn"/>
+    <w:link w:val="u5"/>
     <w:uiPriority w:val="9"/>
     <w:semiHidden/>
     <w:rsid w:val="0068110B"/>
@@ -5385,10 +5310,10 @@
       <w:color w:val="0F4761" w:themeColor="accent1" w:themeShade="BF"/>
     </w:rPr>
   </w:style>
-  <w:style w:type="character" w:customStyle="1" w:styleId="Heading6Char">
-    <w:name w:val="Heading 6 Char"/>
-    <w:basedOn w:val="DefaultParagraphFont"/>
-    <w:link w:val="Heading6"/>
+  <w:style w:type="character" w:customStyle="1" w:styleId="u6Char">
+    <w:name w:val="Đầu đề 6 Char"/>
+    <w:basedOn w:val="Phngmcinhcuaoanvn"/>
+    <w:link w:val="u6"/>
     <w:uiPriority w:val="9"/>
     <w:semiHidden/>
     <w:rsid w:val="0068110B"/>
@@ -5399,10 +5324,10 @@
       <w:color w:val="595959" w:themeColor="text1" w:themeTint="A6"/>
     </w:rPr>
   </w:style>
-  <w:style w:type="character" w:customStyle="1" w:styleId="Heading7Char">
-    <w:name w:val="Heading 7 Char"/>
-    <w:basedOn w:val="DefaultParagraphFont"/>
-    <w:link w:val="Heading7"/>
+  <w:style w:type="character" w:customStyle="1" w:styleId="u7Char">
+    <w:name w:val="Đầu đề 7 Char"/>
+    <w:basedOn w:val="Phngmcinhcuaoanvn"/>
+    <w:link w:val="u7"/>
     <w:uiPriority w:val="9"/>
     <w:semiHidden/>
     <w:rsid w:val="0068110B"/>
@@ -5411,10 +5336,10 @@
       <w:color w:val="595959" w:themeColor="text1" w:themeTint="A6"/>
     </w:rPr>
   </w:style>
-  <w:style w:type="character" w:customStyle="1" w:styleId="Heading8Char">
-    <w:name w:val="Heading 8 Char"/>
-    <w:basedOn w:val="DefaultParagraphFont"/>
-    <w:link w:val="Heading8"/>
+  <w:style w:type="character" w:customStyle="1" w:styleId="u8Char">
+    <w:name w:val="Đầu đề 8 Char"/>
+    <w:basedOn w:val="Phngmcinhcuaoanvn"/>
+    <w:link w:val="u8"/>
     <w:uiPriority w:val="9"/>
     <w:semiHidden/>
     <w:rsid w:val="0068110B"/>
@@ -5425,10 +5350,10 @@
       <w:color w:val="272727" w:themeColor="text1" w:themeTint="D8"/>
     </w:rPr>
   </w:style>
-  <w:style w:type="character" w:customStyle="1" w:styleId="Heading9Char">
-    <w:name w:val="Heading 9 Char"/>
-    <w:basedOn w:val="DefaultParagraphFont"/>
-    <w:link w:val="Heading9"/>
+  <w:style w:type="character" w:customStyle="1" w:styleId="u9Char">
+    <w:name w:val="Đầu đề 9 Char"/>
+    <w:basedOn w:val="Phngmcinhcuaoanvn"/>
+    <w:link w:val="u9"/>
     <w:uiPriority w:val="9"/>
     <w:semiHidden/>
     <w:rsid w:val="0068110B"/>
@@ -5437,11 +5362,11 @@
       <w:color w:val="272727" w:themeColor="text1" w:themeTint="D8"/>
     </w:rPr>
   </w:style>
-  <w:style w:type="paragraph" w:styleId="Title">
+  <w:style w:type="paragraph" w:styleId="Tiu">
     <w:name w:val="Title"/>
-    <w:basedOn w:val="Normal"/>
-    <w:next w:val="Normal"/>
-    <w:link w:val="TitleChar"/>
+    <w:basedOn w:val="Binhthng"/>
+    <w:next w:val="Binhthng"/>
+    <w:link w:val="TiuChar"/>
     <w:uiPriority w:val="10"/>
     <w:qFormat/>
     <w:rsid w:val="0068110B"/>
@@ -5457,10 +5382,10 @@
       <w:szCs w:val="56"/>
     </w:rPr>
   </w:style>
-  <w:style w:type="character" w:customStyle="1" w:styleId="TitleChar">
-    <w:name w:val="Title Char"/>
-    <w:basedOn w:val="DefaultParagraphFont"/>
-    <w:link w:val="Title"/>
+  <w:style w:type="character" w:customStyle="1" w:styleId="TiuChar">
+    <w:name w:val="Tiêu đề Char"/>
+    <w:basedOn w:val="Phngmcinhcuaoanvn"/>
+    <w:link w:val="Tiu"/>
     <w:uiPriority w:val="10"/>
     <w:rsid w:val="0068110B"/>
     <w:rPr>
@@ -5471,11 +5396,11 @@
       <w:szCs w:val="56"/>
     </w:rPr>
   </w:style>
-  <w:style w:type="paragraph" w:styleId="Subtitle">
+  <w:style w:type="paragraph" w:styleId="Tiuphu">
     <w:name w:val="Subtitle"/>
-    <w:basedOn w:val="Normal"/>
-    <w:next w:val="Normal"/>
-    <w:link w:val="SubtitleChar"/>
+    <w:basedOn w:val="Binhthng"/>
+    <w:next w:val="Binhthng"/>
+    <w:link w:val="TiuphuChar"/>
     <w:uiPriority w:val="11"/>
     <w:qFormat/>
     <w:rsid w:val="0068110B"/>
@@ -5492,10 +5417,10 @@
       <w:szCs w:val="28"/>
     </w:rPr>
   </w:style>
-  <w:style w:type="character" w:customStyle="1" w:styleId="SubtitleChar">
-    <w:name w:val="Subtitle Char"/>
-    <w:basedOn w:val="DefaultParagraphFont"/>
-    <w:link w:val="Subtitle"/>
+  <w:style w:type="character" w:customStyle="1" w:styleId="TiuphuChar">
+    <w:name w:val="Tiêu đề phụ Char"/>
+    <w:basedOn w:val="Phngmcinhcuaoanvn"/>
+    <w:link w:val="Tiuphu"/>
     <w:uiPriority w:val="11"/>
     <w:rsid w:val="0068110B"/>
     <w:rPr>
@@ -5506,11 +5431,11 @@
       <w:szCs w:val="28"/>
     </w:rPr>
   </w:style>
-  <w:style w:type="paragraph" w:styleId="Quote">
+  <w:style w:type="paragraph" w:styleId="Litrichdn">
     <w:name w:val="Quote"/>
-    <w:basedOn w:val="Normal"/>
-    <w:next w:val="Normal"/>
-    <w:link w:val="QuoteChar"/>
+    <w:basedOn w:val="Binhthng"/>
+    <w:next w:val="Binhthng"/>
+    <w:link w:val="LitrichdnChar"/>
     <w:uiPriority w:val="29"/>
     <w:qFormat/>
     <w:rsid w:val="0068110B"/>
@@ -5524,10 +5449,10 @@
       <w:color w:val="404040" w:themeColor="text1" w:themeTint="BF"/>
     </w:rPr>
   </w:style>
-  <w:style w:type="character" w:customStyle="1" w:styleId="QuoteChar">
-    <w:name w:val="Quote Char"/>
-    <w:basedOn w:val="DefaultParagraphFont"/>
-    <w:link w:val="Quote"/>
+  <w:style w:type="character" w:customStyle="1" w:styleId="LitrichdnChar">
+    <w:name w:val="Lời trích dẫn Char"/>
+    <w:basedOn w:val="Phngmcinhcuaoanvn"/>
+    <w:link w:val="Litrichdn"/>
     <w:uiPriority w:val="29"/>
     <w:rsid w:val="0068110B"/>
     <w:rPr>
@@ -5536,9 +5461,9 @@
       <w:color w:val="404040" w:themeColor="text1" w:themeTint="BF"/>
     </w:rPr>
   </w:style>
-  <w:style w:type="paragraph" w:styleId="ListParagraph">
+  <w:style w:type="paragraph" w:styleId="oancuaDanhsach">
     <w:name w:val="List Paragraph"/>
-    <w:basedOn w:val="Normal"/>
+    <w:basedOn w:val="Binhthng"/>
     <w:uiPriority w:val="34"/>
     <w:qFormat/>
     <w:rsid w:val="0068110B"/>
@@ -5547,9 +5472,9 @@
       <w:contextualSpacing/>
     </w:pPr>
   </w:style>
-  <w:style w:type="character" w:styleId="IntenseEmphasis">
+  <w:style w:type="character" w:styleId="NhnmnhThm">
     <w:name w:val="Intense Emphasis"/>
-    <w:basedOn w:val="DefaultParagraphFont"/>
+    <w:basedOn w:val="Phngmcinhcuaoanvn"/>
     <w:uiPriority w:val="21"/>
     <w:qFormat/>
     <w:rsid w:val="0068110B"/>
@@ -5559,11 +5484,11 @@
       <w:color w:val="0F4761" w:themeColor="accent1" w:themeShade="BF"/>
     </w:rPr>
   </w:style>
-  <w:style w:type="paragraph" w:styleId="IntenseQuote">
+  <w:style w:type="paragraph" w:styleId="Nhaykepm">
     <w:name w:val="Intense Quote"/>
-    <w:basedOn w:val="Normal"/>
-    <w:next w:val="Normal"/>
-    <w:link w:val="IntenseQuoteChar"/>
+    <w:basedOn w:val="Binhthng"/>
+    <w:next w:val="Binhthng"/>
+    <w:link w:val="NhaykepmChar"/>
     <w:uiPriority w:val="30"/>
     <w:qFormat/>
     <w:rsid w:val="0068110B"/>
@@ -5582,10 +5507,10 @@
       <w:color w:val="0F4761" w:themeColor="accent1" w:themeShade="BF"/>
     </w:rPr>
   </w:style>
-  <w:style w:type="character" w:customStyle="1" w:styleId="IntenseQuoteChar">
-    <w:name w:val="Intense Quote Char"/>
-    <w:basedOn w:val="DefaultParagraphFont"/>
-    <w:link w:val="IntenseQuote"/>
+  <w:style w:type="character" w:customStyle="1" w:styleId="NhaykepmChar">
+    <w:name w:val="Nháy kép Đậm Char"/>
+    <w:basedOn w:val="Phngmcinhcuaoanvn"/>
+    <w:link w:val="Nhaykepm"/>
     <w:uiPriority w:val="30"/>
     <w:rsid w:val="0068110B"/>
     <w:rPr>
@@ -5594,9 +5519,9 @@
       <w:color w:val="0F4761" w:themeColor="accent1" w:themeShade="BF"/>
     </w:rPr>
   </w:style>
-  <w:style w:type="character" w:styleId="IntenseReference">
+  <w:style w:type="character" w:styleId="ThamchiuNhnmnh">
     <w:name w:val="Intense Reference"/>
-    <w:basedOn w:val="DefaultParagraphFont"/>
+    <w:basedOn w:val="Phngmcinhcuaoanvn"/>
     <w:uiPriority w:val="32"/>
     <w:qFormat/>
     <w:rsid w:val="0068110B"/>
@@ -5608,9 +5533,9 @@
       <w:spacing w:val="5"/>
     </w:rPr>
   </w:style>
-  <w:style w:type="table" w:styleId="TableGrid">
+  <w:style w:type="table" w:styleId="LiBang">
     <w:name w:val="Table Grid"/>
-    <w:basedOn w:val="TableNormal"/>
+    <w:basedOn w:val="BangThngthng"/>
     <w:uiPriority w:val="39"/>
     <w:rsid w:val="0099033C"/>
     <w:pPr>
@@ -5637,10 +5562,10 @@
       </w:numPr>
     </w:pPr>
   </w:style>
-  <w:style w:type="paragraph" w:styleId="Header">
+  <w:style w:type="paragraph" w:styleId="utrang">
     <w:name w:val="header"/>
-    <w:basedOn w:val="Normal"/>
-    <w:link w:val="HeaderChar"/>
+    <w:basedOn w:val="Binhthng"/>
+    <w:link w:val="utrangChar"/>
     <w:uiPriority w:val="99"/>
     <w:unhideWhenUsed/>
     <w:rsid w:val="00B3669D"/>
@@ -5652,17 +5577,17 @@
       <w:spacing w:after="0" w:line="240" w:lineRule="auto"/>
     </w:pPr>
   </w:style>
-  <w:style w:type="character" w:customStyle="1" w:styleId="HeaderChar">
-    <w:name w:val="Header Char"/>
-    <w:basedOn w:val="DefaultParagraphFont"/>
-    <w:link w:val="Header"/>
+  <w:style w:type="character" w:customStyle="1" w:styleId="utrangChar">
+    <w:name w:val="Đầu trang Char"/>
+    <w:basedOn w:val="Phngmcinhcuaoanvn"/>
+    <w:link w:val="utrang"/>
     <w:uiPriority w:val="99"/>
     <w:rsid w:val="00B3669D"/>
   </w:style>
-  <w:style w:type="paragraph" w:styleId="Footer">
+  <w:style w:type="paragraph" w:styleId="Chntrang">
     <w:name w:val="footer"/>
-    <w:basedOn w:val="Normal"/>
-    <w:link w:val="FooterChar"/>
+    <w:basedOn w:val="Binhthng"/>
+    <w:link w:val="ChntrangChar"/>
     <w:uiPriority w:val="99"/>
     <w:unhideWhenUsed/>
     <w:rsid w:val="00B3669D"/>
@@ -5674,10 +5599,10 @@
       <w:spacing w:after="0" w:line="240" w:lineRule="auto"/>
     </w:pPr>
   </w:style>
-  <w:style w:type="character" w:customStyle="1" w:styleId="FooterChar">
-    <w:name w:val="Footer Char"/>
-    <w:basedOn w:val="DefaultParagraphFont"/>
-    <w:link w:val="Footer"/>
+  <w:style w:type="character" w:customStyle="1" w:styleId="ChntrangChar">
+    <w:name w:val="Chân trang Char"/>
+    <w:basedOn w:val="Phngmcinhcuaoanvn"/>
+    <w:link w:val="Chntrang"/>
     <w:uiPriority w:val="99"/>
     <w:rsid w:val="00B3669D"/>
   </w:style>

</xml_diff>

<commit_message>
feat(hdnt): implement dedicated clause customization and fix openxml document corruption
</commit_message>
<xml_diff>
--- a/templatesHopDong/Template_HDNT.docx
+++ b/templatesHopDong/Template_HDNT.docx
@@ -2253,10 +2253,6 @@
     <w:p>
       <w:pPr>
         <w:pStyle w:val="oancuaDanhsach"/>
-        <w:numPr>
-          <w:ilvl w:val="0"/>
-          <w:numId w:val="9"/>
-        </w:numPr>
         <w:spacing w:after="0" w:line="276" w:lineRule="auto"/>
         <w:ind w:left="0" w:firstLine="360"/>
         <w:jc w:val="both"/>
@@ -2272,39 +2268,7 @@
           <w:szCs w:val="26"/>
           <w:lang w:val="en-US"/>
         </w:rPr>
-        <w:t xml:space="preserve">Căn cứ vào khối lượng </w:t>
-      </w:r>
-      <w:r>
-        <w:rPr>
-          <w:sz w:val="26"/>
-          <w:szCs w:val="26"/>
-          <w:lang w:val="en-US"/>
-        </w:rPr>
-        <w:t xml:space="preserve">bàn giao vật tư thực tế </w:t>
-      </w:r>
-      <w:r>
-        <w:rPr>
-          <w:sz w:val="26"/>
-          <w:szCs w:val="26"/>
-          <w:lang w:val="en-US"/>
-        </w:rPr>
-        <w:t xml:space="preserve">tại công trình, Bên A và Bên B đo đạc, lập Biên bản xác nhận </w:t>
-      </w:r>
-      <w:r>
-        <w:rPr>
-          <w:sz w:val="26"/>
-          <w:szCs w:val="26"/>
-          <w:lang w:val="en-US"/>
-        </w:rPr>
-        <w:t>khối lượng vật tư</w:t>
-      </w:r>
-      <w:r>
-        <w:rPr>
-          <w:sz w:val="26"/>
-          <w:szCs w:val="26"/>
-          <w:lang w:val="en-US"/>
-        </w:rPr>
-        <w:t xml:space="preserve"> để làm cơ sở thanh toán.</w:t>
+        <w:t>[dieu4_content]</w:t>
       </w:r>
     </w:p>
     <w:p>
@@ -2339,10 +2303,6 @@
     <w:p>
       <w:pPr>
         <w:pStyle w:val="oancuaDanhsach"/>
-        <w:numPr>
-          <w:ilvl w:val="0"/>
-          <w:numId w:val="9"/>
-        </w:numPr>
         <w:spacing w:after="0" w:line="276" w:lineRule="auto"/>
         <w:ind w:left="0" w:firstLine="360"/>
         <w:jc w:val="both"/>
@@ -2358,67 +2318,7 @@
           <w:szCs w:val="26"/>
           <w:lang w:val="en-US"/>
         </w:rPr>
-        <w:t>Thanh toán bằng chuyển khoản.</w:t>
-      </w:r>
-    </w:p>
-    <w:p>
-      <w:pPr>
-        <w:pStyle w:val="oancuaDanhsach"/>
-        <w:numPr>
-          <w:ilvl w:val="0"/>
-          <w:numId w:val="9"/>
-        </w:numPr>
-        <w:spacing w:after="0" w:line="276" w:lineRule="auto"/>
-        <w:ind w:left="0" w:firstLine="360"/>
-        <w:jc w:val="both"/>
-        <w:rPr>
-          <w:sz w:val="26"/>
-          <w:szCs w:val="26"/>
-          <w:lang w:val="en-US"/>
-        </w:rPr>
-      </w:pPr>
-      <w:r>
-        <w:rPr>
-          <w:sz w:val="26"/>
-          <w:szCs w:val="26"/>
-          <w:lang w:val="en-US"/>
-        </w:rPr>
-        <w:lastRenderedPageBreak/>
-        <w:t xml:space="preserve">Căn cứ vào </w:t>
-      </w:r>
-      <w:r>
-        <w:rPr>
-          <w:sz w:val="26"/>
-          <w:szCs w:val="26"/>
-          <w:lang w:val="en-US"/>
-        </w:rPr>
-        <w:t>Biên bản xác nhận khối lượng vật tư</w:t>
-      </w:r>
-      <w:r>
-        <w:rPr>
-          <w:sz w:val="26"/>
-          <w:szCs w:val="26"/>
-          <w:lang w:val="en-US"/>
-        </w:rPr>
-        <w:t xml:space="preserve">, Bên B xuất hóa đơn cho bên A và bên A sẽ thanh toán cho bên B 100% giá trị trong vòng </w:t>
-      </w:r>
-      <w:r>
-        <w:rPr>
-          <w:b/>
-          <w:bCs/>
-          <w:sz w:val="26"/>
-          <w:szCs w:val="26"/>
-          <w:lang w:val="en-US"/>
-        </w:rPr>
-        <w:t>240 ngày</w:t>
-      </w:r>
-      <w:r>
-        <w:rPr>
-          <w:sz w:val="26"/>
-          <w:szCs w:val="26"/>
-          <w:lang w:val="en-US"/>
-        </w:rPr>
-        <w:t xml:space="preserve"> kể từ ngày hai bên đối chiếu và xác nhận công nợ.</w:t>
+        <w:t>[dieu5_content]</w:t>
       </w:r>
     </w:p>
     <w:p>
@@ -2482,10 +2382,6 @@
     <w:p>
       <w:pPr>
         <w:pStyle w:val="oancuaDanhsach"/>
-        <w:numPr>
-          <w:ilvl w:val="0"/>
-          <w:numId w:val="9"/>
-        </w:numPr>
         <w:spacing w:after="0" w:line="276" w:lineRule="auto"/>
         <w:ind w:left="0" w:firstLine="360"/>
         <w:jc w:val="both"/>
@@ -2501,98 +2397,7 @@
           <w:szCs w:val="26"/>
           <w:lang w:val="en-US"/>
         </w:rPr>
-        <w:t xml:space="preserve">Kiểm tra số lượng, chủng loại, chất lượng và bốc xếp hàng hoá từ phương tiện chuyên chở vào cửa hàng; </w:t>
-      </w:r>
-    </w:p>
-    <w:p>
-      <w:pPr>
-        <w:pStyle w:val="oancuaDanhsach"/>
-        <w:numPr>
-          <w:ilvl w:val="0"/>
-          <w:numId w:val="9"/>
-        </w:numPr>
-        <w:spacing w:after="0" w:line="276" w:lineRule="auto"/>
-        <w:ind w:left="0" w:firstLine="360"/>
-        <w:jc w:val="both"/>
-        <w:rPr>
-          <w:sz w:val="26"/>
-          <w:szCs w:val="26"/>
-          <w:lang w:val="en-US"/>
-        </w:rPr>
-      </w:pPr>
-      <w:r>
-        <w:rPr>
-          <w:sz w:val="26"/>
-          <w:szCs w:val="26"/>
-          <w:lang w:val="en-US"/>
-        </w:rPr>
-        <w:t xml:space="preserve">Thanh toán đầy đủ theo đơn giá của bên B và đúng thời gian cho bên B; </w:t>
-      </w:r>
-    </w:p>
-    <w:p>
-      <w:pPr>
-        <w:pStyle w:val="oancuaDanhsach"/>
-        <w:numPr>
-          <w:ilvl w:val="0"/>
-          <w:numId w:val="9"/>
-        </w:numPr>
-        <w:spacing w:after="0" w:line="276" w:lineRule="auto"/>
-        <w:ind w:left="0" w:firstLine="360"/>
-        <w:jc w:val="both"/>
-        <w:rPr>
-          <w:sz w:val="26"/>
-          <w:szCs w:val="26"/>
-          <w:lang w:val="en-US"/>
-        </w:rPr>
-      </w:pPr>
-      <w:r>
-        <w:rPr>
-          <w:sz w:val="26"/>
-          <w:szCs w:val="26"/>
-          <w:lang w:val="en-US"/>
-        </w:rPr>
-        <w:t xml:space="preserve">Xác lập lập </w:t>
-      </w:r>
-      <w:r>
-        <w:rPr>
-          <w:sz w:val="26"/>
-          <w:szCs w:val="26"/>
-          <w:lang w:val="en-US"/>
-        </w:rPr>
-        <w:t>Biên bản xác nhận khối lượng vật tư</w:t>
-      </w:r>
-      <w:r>
-        <w:rPr>
-          <w:sz w:val="26"/>
-          <w:szCs w:val="26"/>
-          <w:lang w:val="en-US"/>
-        </w:rPr>
-        <w:t xml:space="preserve"> thực tế để làm cơ sở thanh toán.</w:t>
-      </w:r>
-    </w:p>
-    <w:p>
-      <w:pPr>
-        <w:pStyle w:val="oancuaDanhsach"/>
-        <w:numPr>
-          <w:ilvl w:val="0"/>
-          <w:numId w:val="9"/>
-        </w:numPr>
-        <w:spacing w:after="0" w:line="276" w:lineRule="auto"/>
-        <w:ind w:left="0" w:firstLine="360"/>
-        <w:jc w:val="both"/>
-        <w:rPr>
-          <w:sz w:val="26"/>
-          <w:szCs w:val="26"/>
-          <w:lang w:val="en-US"/>
-        </w:rPr>
-      </w:pPr>
-      <w:r>
-        <w:rPr>
-          <w:sz w:val="26"/>
-          <w:szCs w:val="26"/>
-          <w:lang w:val="en-US"/>
-        </w:rPr>
-        <w:t>Thanh toán kinh phí cho bên B như Điều 5.</w:t>
+        <w:t>[dieu6_a_content]</w:t>
       </w:r>
     </w:p>
     <w:p>
@@ -2627,10 +2432,6 @@
     <w:p>
       <w:pPr>
         <w:pStyle w:val="oancuaDanhsach"/>
-        <w:numPr>
-          <w:ilvl w:val="0"/>
-          <w:numId w:val="9"/>
-        </w:numPr>
         <w:spacing w:after="0" w:line="276" w:lineRule="auto"/>
         <w:ind w:left="0" w:firstLine="360"/>
         <w:jc w:val="both"/>
@@ -2646,98 +2447,7 @@
           <w:szCs w:val="26"/>
           <w:lang w:val="en-US"/>
         </w:rPr>
-        <w:t xml:space="preserve">Bảo đảm cung ứng đầy đủ cho bên A theo đúng đơn giá đã công bố; </w:t>
-      </w:r>
-    </w:p>
-    <w:p>
-      <w:pPr>
-        <w:pStyle w:val="oancuaDanhsach"/>
-        <w:numPr>
-          <w:ilvl w:val="0"/>
-          <w:numId w:val="9"/>
-        </w:numPr>
-        <w:spacing w:after="0" w:line="276" w:lineRule="auto"/>
-        <w:ind w:left="0" w:firstLine="360"/>
-        <w:jc w:val="both"/>
-        <w:rPr>
-          <w:sz w:val="26"/>
-          <w:szCs w:val="26"/>
-          <w:lang w:val="en-US"/>
-        </w:rPr>
-      </w:pPr>
-      <w:r>
-        <w:rPr>
-          <w:sz w:val="26"/>
-          <w:szCs w:val="26"/>
-          <w:lang w:val="en-US"/>
-        </w:rPr>
-        <w:t xml:space="preserve">Vận chuyển hàng hoá bảo đảm, an toàn đến giao tận địa chi đã đăng kí của bên A; </w:t>
-      </w:r>
-    </w:p>
-    <w:p>
-      <w:pPr>
-        <w:pStyle w:val="oancuaDanhsach"/>
-        <w:numPr>
-          <w:ilvl w:val="0"/>
-          <w:numId w:val="9"/>
-        </w:numPr>
-        <w:spacing w:after="0" w:line="276" w:lineRule="auto"/>
-        <w:ind w:left="0" w:firstLine="360"/>
-        <w:jc w:val="both"/>
-        <w:rPr>
-          <w:sz w:val="26"/>
-          <w:szCs w:val="26"/>
-          <w:lang w:val="en-US"/>
-        </w:rPr>
-      </w:pPr>
-      <w:r>
-        <w:rPr>
-          <w:sz w:val="26"/>
-          <w:szCs w:val="26"/>
-          <w:lang w:val="en-US"/>
-        </w:rPr>
-        <w:t xml:space="preserve">Cùng bên B lập </w:t>
-      </w:r>
-      <w:r>
-        <w:rPr>
-          <w:sz w:val="26"/>
-          <w:szCs w:val="26"/>
-          <w:lang w:val="en-US"/>
-        </w:rPr>
-        <w:t>Biên bản xác nhận khối lượng vật tư</w:t>
-      </w:r>
-      <w:r>
-        <w:rPr>
-          <w:sz w:val="26"/>
-          <w:szCs w:val="26"/>
-          <w:lang w:val="en-US"/>
-        </w:rPr>
-        <w:t xml:space="preserve"> thực tế để làm cơ sở thanh toán và thanh lý hợp đồng.</w:t>
-      </w:r>
-    </w:p>
-    <w:p>
-      <w:pPr>
-        <w:pStyle w:val="oancuaDanhsach"/>
-        <w:numPr>
-          <w:ilvl w:val="0"/>
-          <w:numId w:val="9"/>
-        </w:numPr>
-        <w:spacing w:after="0" w:line="276" w:lineRule="auto"/>
-        <w:ind w:left="0" w:firstLine="360"/>
-        <w:jc w:val="both"/>
-        <w:rPr>
-          <w:sz w:val="26"/>
-          <w:szCs w:val="26"/>
-          <w:lang w:val="en-US"/>
-        </w:rPr>
-      </w:pPr>
-      <w:r>
-        <w:rPr>
-          <w:sz w:val="26"/>
-          <w:szCs w:val="26"/>
-          <w:lang w:val="en-US"/>
-        </w:rPr>
-        <w:t>Xuất hóa đơn thuế GTGT cho bên A .</w:t>
+        <w:t>[dieu6_b_content]</w:t>
       </w:r>
     </w:p>
     <w:p>

</xml_diff>